<commit_message>
writeup edits + drop section banner comments
</commit_message>
<xml_diff>
--- a/Final_Writeup.docx
+++ b/Final_Writeup.docx
@@ -64,7 +64,7 @@
           <w:sz w:val="22"/>
           <w:szCs w:val="22"/>
         </w:rPr>
-        <w:t xml:space="preserve">COE 332 — Software Engineering and Design</w:t>
+        <w:t xml:space="preserve">COE 332: Software Engineering and Design</w:t>
       </w:r>
     </w:p>
     <w:p>
@@ -147,7 +147,7 @@
           <w:sz w:val="22"/>
           <w:szCs w:val="22"/>
         </w:rPr>
-        <w:t xml:space="preserve">Spaceflight is one of the most heavily instrumented domains in modern engineering. Every orbital launch generates dense metadata — the rocket configuration, the agency, the launch pad, the target orbit, the eventual outcome — and decades of accumulated launches form a dataset large enough to make meaningful patterns visible. Recent missions like Artemis II, NASA's first crewed lunar mission since Apollo 17 in 1972, sit at the intersection of historical legacy and modern commercial spaceflight, making them especially worth studying alongside the broader launch record.</w:t>
+        <w:t xml:space="preserve">Spaceflight is one of the most heavily instrumented domains in modern engineering. Every orbital launch generates dense metadata about the rocket configuration, the agency, the launch pad, the target orbit, and the eventual outcome. Decades of accumulated launches form a dataset large enough to make meaningful patterns visible. Recent missions like Artemis II, NASA's first crewed lunar mission since Apollo 17 in 1972, sit at the intersection of historical legacy and modern commercial spaceflight, which makes them especially worth studying alongside the broader launch record.</w:t>
       </w:r>
     </w:p>
     <w:p>
@@ -183,7 +183,7 @@
           <w:sz w:val="22"/>
           <w:szCs w:val="22"/>
         </w:rPr>
-        <w:t xml:space="preserve">There are two motivations behind the design. First, programmatic access to launch data is uncommon. Most existing dashboards present aggregate views that are useful at a glance but cannot answer arbitrary user questions; ours is a programmable surface that supports custom queries and on-demand visualization. Second, the project is a deliberate end-to-end exercise in modern cloud-native engineering. Every concept covered in COE 332 — type-driven validation, containerization, asynchronous job queues, Kubernetes deployments and ingress routing, persistent storage — comes together here in a single working system, deployable both on a developer's laptop and on a production-grade cluster.</w:t>
+        <w:t xml:space="preserve">Two things motivated the design. First, programmatic access to launch data is uncommon. Most existing dashboards present aggregate views that are useful at a glance but cannot answer arbitrary user questions, so we wanted a programmable surface that supports custom queries and on-demand visualization. Second, the project is an end-to-end exercise that exercises essentially every concept covered in COE 332, including type-driven validation, containerization, asynchronous job queues, Kubernetes deployments, ingress routing, and persistent storage. The result is a single working system that runs identically on a laptop and on a production cluster.</w:t>
       </w:r>
     </w:p>
     <w:p>
@@ -259,7 +259,7 @@
           <w:sz w:val="22"/>
           <w:szCs w:val="22"/>
         </w:rPr>
-        <w:t xml:space="preserve"> API maintained by The Space Devs (https://ll.thespacedevs.com/2.2.0/launch/), a public dataset cataloging every notable orbital launch attempt since Sputnik 1 in 1957. The full set contains approximately 7,800 records — successful and failed past launches, scheduled future missions, and incomplete entries for missions still being planned. Our deployed instance loaded 7,851 records into Redis on the class Kubernetes cluster as of project completion.</w:t>
+        <w:t xml:space="preserve"> API maintained by The Space Devs (https://ll.thespacedevs.com/2.2.0/launch/), a public dataset cataloging every notable orbital launch attempt since Sputnik 1 in 1957. The full set contains roughly 7,800 records, including successful and failed past launches, scheduled future missions, and incomplete entries for missions still being planned. Our deployed instance loaded 7,851 records into Redis on the class Kubernetes cluster as of project completion.</w:t>
       </w:r>
     </w:p>
     <w:p>
@@ -311,7 +311,7 @@
           <w:sz w:val="22"/>
           <w:szCs w:val="22"/>
         </w:rPr>
-        <w:t xml:space="preserve"> — a UUID-style identifier unique to each launch.</w:t>
+        <w:t xml:space="preserve">, a UUID-style identifier unique to each launch.</w:t>
       </w:r>
     </w:p>
     <w:p>
@@ -345,7 +345,7 @@
           <w:sz w:val="22"/>
           <w:szCs w:val="22"/>
         </w:rPr>
-        <w:t xml:space="preserve"> — a human-readable label, typically rocket plus mission ("SLS Block 1 | Artemis II").</w:t>
+        <w:t xml:space="preserve">, a human-readable label that typically combines the rocket and mission ("SLS Block 1 | Artemis II").</w:t>
       </w:r>
     </w:p>
     <w:p>
@@ -379,7 +379,7 @@
           <w:sz w:val="22"/>
           <w:szCs w:val="22"/>
         </w:rPr>
-        <w:t xml:space="preserve"> — "no earlier than" timestamp in ISO 8601 format, representing the scheduled or actual launch time (e.g., 2026-04-01T22:35:12Z).</w:t>
+        <w:t xml:space="preserve">, a "no earlier than" ISO 8601 timestamp representing the scheduled or actual launch time (for example, 2026-04-01T22:35:12Z).</w:t>
       </w:r>
     </w:p>
     <w:p>
@@ -413,7 +413,7 @@
           <w:sz w:val="22"/>
           <w:szCs w:val="22"/>
         </w:rPr>
-        <w:t xml:space="preserve"> — outcome category: Launch Successful, Launch Failure, Partial Failure, To Be Determined, Go for Launch, etc.</w:t>
+        <w:t xml:space="preserve">, an outcome category like Launch Successful, Launch Failure, Partial Failure, To Be Determined, or Go for Launch.</w:t>
       </w:r>
     </w:p>
     <w:p>
@@ -447,7 +447,7 @@
           <w:sz w:val="22"/>
           <w:szCs w:val="22"/>
         </w:rPr>
-        <w:t xml:space="preserve"> — the agency or company conducting the launch (NASA, SpaceX, Soviet Space Program, etc.) along with its type classification.</w:t>
+        <w:t xml:space="preserve">, the agency or company conducting the launch (NASA, SpaceX, Soviet Space Program, and so on) along with its type classification.</w:t>
       </w:r>
     </w:p>
     <w:p>
@@ -481,7 +481,7 @@
           <w:sz w:val="22"/>
           <w:szCs w:val="22"/>
         </w:rPr>
-        <w:t xml:space="preserve"> — payload information: mission name, type ("Human Exploration", "Communications", "Earth Science"), and target orbit (LEO, GTO, Lunar Orbit).</w:t>
+        <w:t xml:space="preserve">, payload information including the mission name, type ("Human Exploration", "Communications", "Earth Science"), and target orbit (LEO, GTO, Lunar Orbit).</w:t>
       </w:r>
     </w:p>
     <w:p>
@@ -515,7 +515,7 @@
           <w:sz w:val="22"/>
           <w:szCs w:val="22"/>
         </w:rPr>
-        <w:t xml:space="preserve"> — the launch vehicle: family ("SLS", "Falcon", "Soyuz") and specific variant.</w:t>
+        <w:t xml:space="preserve">, the launch vehicle by family ("SLS", "Falcon", "Soyuz") and specific variant.</w:t>
       </w:r>
     </w:p>
     <w:p>
@@ -549,7 +549,7 @@
           <w:sz w:val="22"/>
           <w:szCs w:val="22"/>
         </w:rPr>
-        <w:t xml:space="preserve"> — the launch pad: name, latitude, longitude, country code, and parent location.</w:t>
+        <w:t xml:space="preserve">, the launch pad's name, latitude, longitude, country code, and parent location.</w:t>
       </w:r>
     </w:p>
     <w:p>
@@ -1481,7 +1481,7 @@
           <w:sz w:val="22"/>
           <w:szCs w:val="22"/>
         </w:rPr>
-        <w:t xml:space="preserve"> — a long-running set of identical pods (one each for Redis, the API, and the worker).</w:t>
+        <w:t xml:space="preserve">, a long-running set of identical pods (one each for Redis, the API, and the worker).</w:t>
       </w:r>
     </w:p>
     <w:p>
@@ -1515,7 +1515,7 @@
           <w:sz w:val="22"/>
           <w:szCs w:val="22"/>
         </w:rPr>
-        <w:t xml:space="preserve"> — an internal stable network address that routes traffic to a deployment regardless of which pod is currently up.</w:t>
+        <w:t xml:space="preserve">, an internal stable network address that routes traffic to a deployment regardless of which pod is currently up.</w:t>
       </w:r>
     </w:p>
     <w:p>
@@ -1549,7 +1549,7 @@
           <w:sz w:val="22"/>
           <w:szCs w:val="22"/>
         </w:rPr>
-        <w:t xml:space="preserve"> — exposes the API on a port reachable from outside the cluster's internal network.</w:t>
+        <w:t xml:space="preserve">, which exposes the API on a port reachable from outside the cluster's internal network.</w:t>
       </w:r>
     </w:p>
     <w:p>
@@ -1583,7 +1583,7 @@
           <w:sz w:val="22"/>
           <w:szCs w:val="22"/>
         </w:rPr>
-        <w:t xml:space="preserve"> — maps an external hostname (wsuan.coe332.tacc.cloud) to a service inside the cluster.</w:t>
+        <w:t xml:space="preserve">, which maps an external hostname (wsuan.coe332.tacc.cloud) to a service inside the cluster.</w:t>
       </w:r>
     </w:p>
     <w:p>
@@ -1617,7 +1617,7 @@
           <w:sz w:val="22"/>
           <w:szCs w:val="22"/>
         </w:rPr>
-        <w:t xml:space="preserve"> — requests a piece of cluster storage that survives pod restarts. Our Redis pod uses one to retain RDB snapshots.</w:t>
+        <w:t xml:space="preserve">, a request for a piece of cluster storage that survives pod restarts. Our Redis pod uses one to retain RDB snapshots.</w:t>
       </w:r>
     </w:p>
     <w:p>
@@ -1669,7 +1669,7 @@
           <w:sz w:val="22"/>
           <w:szCs w:val="22"/>
         </w:rPr>
-        <w:t xml:space="preserve">matplotlib is the de facto Python plotting library. The worker uses it in headless "Agg" mode — the backend is set to "Agg" via </w:t>
+        <w:t xml:space="preserve">matplotlib is the de facto Python plotting library. The worker uses it in headless "Agg" mode, with the backend set via </w:t>
       </w:r>
       <w:r>
         <w:rPr>
@@ -1717,7 +1717,7 @@
           <w:sz w:val="22"/>
           <w:szCs w:val="22"/>
         </w:rPr>
-        <w:t xml:space="preserve"> is imported — because the worker runs inside a Docker container without a display. Each plot is rendered to an in-memory PNG buffer and stored in Redis rather than written to disk.</w:t>
+        <w:t xml:space="preserve"> is imported. This is required because the worker runs inside a Docker container without a display. Each plot is rendered to an in-memory PNG buffer and stored in Redis rather than written to disk.</w:t>
       </w:r>
     </w:p>
     <w:p>
@@ -1919,7 +1919,7 @@
           <w:sz w:val="22"/>
           <w:szCs w:val="22"/>
         </w:rPr>
-        <w:t xml:space="preserve"> The central data store and message bus. Four logical databases (raw data, queue, jobs, results) keep concerns separate. Crucially, the queue and the results are in separate databases, so dropping the queue to recover from a crash does not destroy completed images.</w:t>
+        <w:t xml:space="preserve"> The central data store and message bus. Four logical databases (raw data, queue, jobs, results) keep concerns separate. The queue and the results live in separate databases, so dropping the queue to recover from a crash does not destroy completed images.</w:t>
       </w:r>
     </w:p>
     <w:p>
@@ -2021,7 +2021,7 @@
           <w:sz w:val="22"/>
           <w:szCs w:val="22"/>
         </w:rPr>
-        <w:t xml:space="preserve"> — a binary snapshot of the entire dataset, refreshed every 60 seconds if at least one key has changed.</w:t>
+        <w:t xml:space="preserve">, a binary snapshot of the entire dataset, refreshed every 60 seconds if at least one key has changed.</w:t>
       </w:r>
     </w:p>
     <w:p>
@@ -2055,7 +2055,7 @@
           <w:sz w:val="22"/>
           <w:szCs w:val="22"/>
         </w:rPr>
-        <w:t xml:space="preserve"> — a log of every write operation, providing more granular durability between snapshots.</w:t>
+        <w:t xml:space="preserve">, a log of every write operation, which provides more granular durability between snapshots.</w:t>
       </w:r>
     </w:p>
     <w:p>
@@ -3461,7 +3461,7 @@
           <w:sz w:val="22"/>
           <w:szCs w:val="22"/>
         </w:rPr>
-        <w:t xml:space="preserve"> — case-insensitive substring match against the launch's status name. ?status=Failure returns every record whose status contains "failure".</w:t>
+        <w:t xml:space="preserve">, a case-insensitive substring match against the launch's status name. ?status=Failure returns every record whose status contains "failure".</w:t>
       </w:r>
     </w:p>
     <w:p>
@@ -3495,7 +3495,7 @@
           <w:sz w:val="22"/>
           <w:szCs w:val="22"/>
         </w:rPr>
-        <w:t xml:space="preserve"> — case-insensitive substring match against the launch service provider's name. ?provider=SpaceX returns 790 launches.</w:t>
+        <w:t xml:space="preserve">, a case-insensitive substring match against the launch service provider's name. ?provider=SpaceX returns 790 launches.</w:t>
       </w:r>
     </w:p>
     <w:p>
@@ -3553,7 +3553,7 @@
           <w:sz w:val="22"/>
           <w:szCs w:val="22"/>
         </w:rPr>
-        <w:t xml:space="preserve"> — ISO 8601 date strings bracketing the net field. Date arithmetic is string-based, which works correctly because the LL2 net format always uses the canonical YYYY-MM-DDTHH:MM:SSZ form.</w:t>
+        <w:t xml:space="preserve">, ISO 8601 date strings bracketing the net field. Date arithmetic is string-based, which works correctly because the LL2 net format always uses the canonical YYYY-MM-DDTHH:MM:SSZ form.</w:t>
       </w:r>
     </w:p>
     <w:p>
@@ -4325,7 +4325,7 @@
           <w:sz w:val="22"/>
           <w:szCs w:val="22"/>
         </w:rPr>
-        <w:t xml:space="preserve">Three plot types are supported. They are deliberately a focused set rather than an exhaustive one; the architecture supports adding more by writing a new function in src/worker.py and registering it in the dispatch table.</w:t>
+        <w:t xml:space="preserve">Three plot types are supported. We picked a focused set rather than an exhaustive one; the architecture supports adding more by writing a new function in src/worker.py and registering it in the dispatch table.</w:t>
       </w:r>
     </w:p>
     <w:p>
@@ -4359,7 +4359,7 @@
           <w:sz w:val="22"/>
           <w:szCs w:val="22"/>
         </w:rPr>
-        <w:t xml:space="preserve"> — a stacked bar chart of successful vs. failed launches per year across the entire dataset. Optional start_year and end_year parameters narrow the range. Reveals long-term trends including the dramatic uptick in launch volume from the 2020s onward.</w:t>
+        <w:t xml:space="preserve">, a stacked bar chart of successful vs. failed launches per year across the entire dataset. Optional start_year and end_year parameters narrow the range. It reveals long-term trends including the sharp uptick in launch volume from the 2020s onward.</w:t>
       </w:r>
     </w:p>
     <w:p>
@@ -4393,7 +4393,7 @@
           <w:sz w:val="22"/>
           <w:szCs w:val="22"/>
         </w:rPr>
-        <w:t xml:space="preserve"> — a horizontal bar chart of the top 15 launch providers by launch count. Shows the dominance of the Soviet Space Program historically and SpaceX in the modern era.</w:t>
+        <w:t xml:space="preserve">, a horizontal bar chart of the top 15 launch providers by launch count. It shows the dominance of the Soviet Space Program historically and SpaceX in the modern era.</w:t>
       </w:r>
     </w:p>
     <w:p>
@@ -4427,7 +4427,7 @@
           <w:sz w:val="22"/>
           <w:szCs w:val="22"/>
         </w:rPr>
-        <w:t xml:space="preserve"> — a pie chart of launch outcomes for a filtered subset, with optional provider or rocket_family parameters. Includes a legend with absolute counts so small slices remain identifiable.</w:t>
+        <w:t xml:space="preserve">, a pie chart of launch outcomes for a filtered subset, with optional provider or rocket_family parameters. It includes a legend with absolute counts so that small slices remain identifiable.</w:t>
       </w:r>
     </w:p>
     <w:p>
@@ -4461,7 +4461,7 @@
           <w:sz w:val="22"/>
           <w:szCs w:val="22"/>
         </w:rPr>
-        <w:t xml:space="preserve">Unit 4 of COE 332 introduced several design principles for software systems. The architecture of this project applies them deliberately.</w:t>
+        <w:t xml:space="preserve">Unit 4 of COE 332 introduced several design principles for software systems. The architecture of this project applies most of them.</w:t>
       </w:r>
     </w:p>
     <w:p>
@@ -4931,7 +4931,7 @@
           <w:sz w:val="26"/>
           <w:szCs w:val="26"/>
         </w:rPr>
-        <w:t xml:space="preserve">7.8 Documentation as a First-Class Artifact</w:t>
+        <w:t xml:space="preserve">7.8 Documentation</w:t>
       </w:r>
     </w:p>
     <w:p>
@@ -5051,7 +5051,7 @@
           <w:sz w:val="22"/>
           <w:szCs w:val="22"/>
         </w:rPr>
-        <w:t xml:space="preserve">Public APIs survive only when consumers respect their published limits. Our ingest script implements exponential backoff on rate-limit responses and saves progress incrementally so that a single user does not hammer the LL2 endpoint repeatedly when retrying. We also cache the dataset on disk after one-time ingest, so that all subsequent reads in the deployed system are served from our own Redis rather than from LL2 — this means our application's load on the upstream API is exactly one ingest pass per deployment, regardless of how many user requests we receive.</w:t>
+        <w:t xml:space="preserve">Public APIs survive only when consumers respect their published limits. Our ingest script implements exponential backoff on rate-limit responses and saves progress incrementally so that a single user does not hammer the LL2 endpoint repeatedly when retrying. We also cache the dataset on disk after one-time ingest, so all subsequent reads in the deployed system are served from our own Redis rather than from LL2. The result is that our application's load on the upstream API is exactly one ingest pass per deployment, regardless of how many user requests we receive.</w:t>
       </w:r>
     </w:p>
     <w:p>
@@ -5153,7 +5153,7 @@
           <w:sz w:val="22"/>
           <w:szCs w:val="22"/>
         </w:rPr>
-        <w:t xml:space="preserve">This project does not collect any user data — it exposes only public launch records and accepts only well-typed analysis-job parameters. Where authentication credentials would normally appear (Docker Hub login, TACC account), we deliberately do not commit them to the repository, and the deploy script invokes interactive login prompts when needed. A production deployment would add HTTPS termination and rate limiting at the ingress layer; we documented this as a known limitation rather than disabling the feature silently.</w:t>
+        <w:t xml:space="preserve">This project does not collect any user data. It exposes only public launch records and accepts only well-typed analysis-job parameters. Where authentication credentials would normally appear (Docker Hub login, TACC account), we don't commit them to the repository, and the deploy script invokes interactive login prompts when needed. A production deployment would add HTTPS termination and rate limiting at the ingress layer; we documented this as a known limitation rather than disabling the feature silently.</w:t>
       </w:r>
     </w:p>
     <w:p>
@@ -5741,7 +5741,7 @@
         <w:sz w:val="18"/>
         <w:szCs w:val="18"/>
       </w:rPr>
-      <w:t xml:space="preserve">Suan &amp; Derden — Artemis II Launch Data Analysis</w:t>
+      <w:t xml:space="preserve">Suan &amp; Derden · Artemis II Launch Data Analysis</w:t>
     </w:r>
   </w:p>
 </w:hdr>

</xml_diff>